<commit_message>
Close out: Study 2 networks, bootstrap CIs, supplement doc
Adds ISSP scale development and per-country belief->behavior networks
(scripts/analysis-issp*.R, _issp-scale-defs.R), bootstrap CIs on
shortest-path distances (_spl-bootstrap.R), a new
environ-beliefs-supplement.qmd (S1 Study 1 EGA/UVA, S2 Study 2 scale
construction, S3 by-country results), Study 2 manuscript prose and
Figure 3, and recolored Study 1 network figures. Re-rendered all
outputs (HTML/PDF/DOCX) for both documents.

Co-Authored-By: Claude Sonnet 5 <noreply@anthropic.com>
Claude-Session: https://claude.ai/code/session_018Ugd1NU12xkNjNt3ANyqwJ
</commit_message>
<xml_diff>
--- a/_output/environ-beliefs.docx
+++ b/_output/environ-beliefs.docx
@@ -54,10 +54,19 @@
       </w:r>
     </w:p>
     <w:bookmarkEnd w:id="12"/>
+    <w:bookmarkStart w:id="28" w:name="study-1"/>
+    <w:p>
+      <w:pPr>
+        <w:pStyle w:val="Heading1"/>
+      </w:pPr>
+      <w:r>
+        <w:t xml:space="preserve">Study 1</w:t>
+      </w:r>
+    </w:p>
     <w:bookmarkStart w:id="14" w:name="data-and-measures"/>
     <w:p>
       <w:pPr>
-        <w:pStyle w:val="Heading1"/>
+        <w:pStyle w:val="Heading2"/>
       </w:pPr>
       <w:r>
         <w:t xml:space="preserve">Data and Measures</w:t>
@@ -68,23 +77,6 @@
         <w:pStyle w:val="FirstParagraph"/>
       </w:pPr>
       <w:r>
-        <w:t xml:space="preserve">To examine the relationship between cultural cognition, environmental orientations, and behavior we draw on a sample of 501 adults living in the US purchased through Survey Sampling Inc. The survey was administered online in July 2017. The sample size was determined by cost considerations. IRB approval for the survey was approved by [redacted for blind review] Human Subjects Committee on April 3, 2017, protocol number 37-17-0256. Our analysis was not pre-registered.</w:t>
-      </w:r>
-    </w:p>
-    <w:bookmarkStart w:id="13" w:name="measures"/>
-    <w:p>
-      <w:pPr>
-        <w:pStyle w:val="Heading2"/>
-      </w:pPr>
-      <w:r>
-        <w:t xml:space="preserve">Measures</w:t>
-      </w:r>
-    </w:p>
-    <w:p>
-      <w:pPr>
-        <w:pStyle w:val="FirstParagraph"/>
-      </w:pPr>
-      <w:r>
         <w:t xml:space="preserve">Our dependent variable is pro-environmental behaviors, and we use a 13-item scale from the 2000 Gallup Earth Day Poll. Respondents were asked,</w:t>
       </w:r>
       <w:r>
@@ -208,37 +200,7 @@
         <w:pStyle w:val="BodyText"/>
       </w:pPr>
       <w:r>
-        <w:t xml:space="preserve">As noted, we have two measures of environmental orientations including the Connectedness to Nature Scale (CNS) and the New Ecological Paradigm (NEP). The CNS was measured based on agreement with a 1 - strongly disagree to 5 - strongly agree scale with 14 statements such as, I often feel a sense of oneness with the natural world around me and I have a deep understanding of how my actions affect the natural world. The Cronbach’s α for the CNS is 0.81. Similar to the CNS, the NEP scale is based on agreement on a 1 to 5 scale with several statements including We are approaching the limit of the number of people the earth can support and The balance of nature is very delicate and easily upset. The Cronbach’s α for the NEP is 0.82. Table 1 shows the summary statistics and correlations for each of the scales.</w:t>
-      </w:r>
-    </w:p>
-    <w:bookmarkEnd w:id="13"/>
-    <w:bookmarkEnd w:id="14"/>
-    <w:bookmarkStart w:id="15" w:name="belief-system-network-analysis"/>
-    <w:p>
-      <w:pPr>
-        <w:pStyle w:val="Heading1"/>
-      </w:pPr>
-      <w:r>
-        <w:t xml:space="preserve">Belief System Network Analysis</w:t>
-      </w:r>
-    </w:p>
-    <w:bookmarkEnd w:id="15"/>
-    <w:bookmarkStart w:id="26" w:name="results"/>
-    <w:p>
-      <w:pPr>
-        <w:pStyle w:val="Heading1"/>
-      </w:pPr>
-      <w:r>
-        <w:t xml:space="preserve">Results</w:t>
-      </w:r>
-    </w:p>
-    <w:bookmarkStart w:id="20" w:name="environmental-belief-system-network"/>
-    <w:p>
-      <w:pPr>
-        <w:pStyle w:val="Heading2"/>
-      </w:pPr>
-      <w:r>
-        <w:t xml:space="preserve">Environmental Belief System Network</w:t>
+        <w:t xml:space="preserve">As noted, we have two measures of environmental orientations including the Connectedness to Nature Scale (CNS) and the New Ecological Paradigm (NEP). The CNS was measured based on agreement with a 1 - strongly disagree to 5 - strongly agree scale with 14 statements such as, I often feel a sense of oneness with the natural world around me and I have a deep understanding of how my actions affect the natural world. The Cronbach’s α for the CNS is 0.81. Similar to the CNS, the NEP scale is based on agreement on a 1 to 5 scale with several statements including We are approaching the limit of the number of people the earth can support and The balance of nature is very delicate and easily upset. The Cronbach’s α for the NEP is 0.82. Table 1 shows the summary statistics and correlations for each of the scales. Exploratory graph analysis confirms that the NEP and CNS items each form a single dimension, and the belief network is not sensitive to whether the scales are scored as raw item means or as network dimension scores. The supplemental materials report this analysis.</w:t>
       </w:r>
     </w:p>
     <w:tbl>
@@ -254,7 +216,1443 @@
       <w:tr>
         <w:tc>
           <w:tcPr/>
-          <w:bookmarkStart w:id="19" w:name="fig-envNetwork"/>
+          <w:bookmarkStart w:id="13" w:name="tbl-descriptives"/>
+          <w:p>
+            <w:pPr>
+              <w:jc w:val="center"/>
+            </w:pPr>
+            <w:pPr>
+              <w:jc w:val="left"/>
+              <w:spacing w:before="200"/>
+              <w:pStyle w:val="ImageCaption"/>
+            </w:pPr>
+            <w:r>
+              <w:t xml:space="preserve">Table 1: Summary statistics and correlations for the Study 1 variables (N = 1,000). NEP and CNS are item means oriented so that higher = more pro-environmental.</w:t>
+            </w:r>
+          </w:p>
+          <w:tbl>
+            <w:tblPr>
+              <w:tblStyle w:val="Table"/>
+              <w:tblW w:type="pct" w:w="5000"/>
+              <w:tblLayout w:type="fixed"/>
+              <w:tblLook w:firstRow="1" w:lastRow="0" w:firstColumn="0" w:lastColumn="0" w:noHBand="0" w:noVBand="0" w:val="0020"/>
+            </w:tblPr>
+            <w:tblGrid>
+              <w:gridCol w:w="2751"/>
+              <w:gridCol w:w="416"/>
+              <w:gridCol w:w="416"/>
+              <w:gridCol w:w="416"/>
+              <w:gridCol w:w="333"/>
+              <w:gridCol w:w="500"/>
+              <w:gridCol w:w="500"/>
+              <w:gridCol w:w="500"/>
+              <w:gridCol w:w="500"/>
+              <w:gridCol w:w="500"/>
+              <w:gridCol w:w="500"/>
+              <w:gridCol w:w="333"/>
+              <w:gridCol w:w="250"/>
+            </w:tblGrid>
+            <w:tr>
+              <w:trPr>
+                <w:tblHeader w:val="on"/>
+              </w:trPr>
+              <w:tc>
+                <w:tcPr/>
+                <w:p>
+                  <w:pPr>
+                    <w:pStyle w:val="Compact"/>
+                    <w:jc w:val="left"/>
+                    <w:jc w:val="center"/>
+                  </w:pPr>
+                  <w:r>
+                    <w:t xml:space="preserve">Variable</w:t>
+                  </w:r>
+                </w:p>
+              </w:tc>
+              <w:tc>
+                <w:tcPr/>
+                <w:p>
+                  <w:pPr>
+                    <w:pStyle w:val="Compact"/>
+                    <w:jc w:val="right"/>
+                    <w:jc w:val="center"/>
+                  </w:pPr>
+                  <w:r>
+                    <w:t xml:space="preserve">M</w:t>
+                  </w:r>
+                </w:p>
+              </w:tc>
+              <w:tc>
+                <w:tcPr/>
+                <w:p>
+                  <w:pPr>
+                    <w:pStyle w:val="Compact"/>
+                    <w:jc w:val="right"/>
+                    <w:jc w:val="center"/>
+                  </w:pPr>
+                  <w:r>
+                    <w:t xml:space="preserve">SD</w:t>
+                  </w:r>
+                </w:p>
+              </w:tc>
+              <w:tc>
+                <w:tcPr/>
+                <w:p>
+                  <w:pPr>
+                    <w:pStyle w:val="Compact"/>
+                    <w:jc w:val="right"/>
+                    <w:jc w:val="center"/>
+                  </w:pPr>
+                  <w:r>
+                    <w:t xml:space="preserve">Min</w:t>
+                  </w:r>
+                </w:p>
+              </w:tc>
+              <w:tc>
+                <w:tcPr/>
+                <w:p>
+                  <w:pPr>
+                    <w:pStyle w:val="Compact"/>
+                    <w:jc w:val="right"/>
+                    <w:jc w:val="center"/>
+                  </w:pPr>
+                  <w:r>
+                    <w:t xml:space="preserve">Max</w:t>
+                  </w:r>
+                </w:p>
+              </w:tc>
+              <w:tc>
+                <w:tcPr/>
+                <w:p>
+                  <w:pPr>
+                    <w:pStyle w:val="Compact"/>
+                    <w:jc w:val="right"/>
+                    <w:jc w:val="center"/>
+                  </w:pPr>
+                  <w:r>
+                    <w:t xml:space="preserve">1</w:t>
+                  </w:r>
+                </w:p>
+              </w:tc>
+              <w:tc>
+                <w:tcPr/>
+                <w:p>
+                  <w:pPr>
+                    <w:pStyle w:val="Compact"/>
+                    <w:jc w:val="right"/>
+                    <w:jc w:val="center"/>
+                  </w:pPr>
+                  <w:r>
+                    <w:t xml:space="preserve">2</w:t>
+                  </w:r>
+                </w:p>
+              </w:tc>
+              <w:tc>
+                <w:tcPr/>
+                <w:p>
+                  <w:pPr>
+                    <w:pStyle w:val="Compact"/>
+                    <w:jc w:val="right"/>
+                    <w:jc w:val="center"/>
+                  </w:pPr>
+                  <w:r>
+                    <w:t xml:space="preserve">3</w:t>
+                  </w:r>
+                </w:p>
+              </w:tc>
+              <w:tc>
+                <w:tcPr/>
+                <w:p>
+                  <w:pPr>
+                    <w:pStyle w:val="Compact"/>
+                    <w:jc w:val="right"/>
+                    <w:jc w:val="center"/>
+                  </w:pPr>
+                  <w:r>
+                    <w:t xml:space="preserve">4</w:t>
+                  </w:r>
+                </w:p>
+              </w:tc>
+              <w:tc>
+                <w:tcPr/>
+                <w:p>
+                  <w:pPr>
+                    <w:pStyle w:val="Compact"/>
+                    <w:jc w:val="right"/>
+                    <w:jc w:val="center"/>
+                  </w:pPr>
+                  <w:r>
+                    <w:t xml:space="preserve">5</w:t>
+                  </w:r>
+                </w:p>
+              </w:tc>
+              <w:tc>
+                <w:tcPr/>
+                <w:p>
+                  <w:pPr>
+                    <w:pStyle w:val="Compact"/>
+                    <w:jc w:val="right"/>
+                    <w:jc w:val="center"/>
+                  </w:pPr>
+                  <w:r>
+                    <w:t xml:space="preserve">6</w:t>
+                  </w:r>
+                </w:p>
+              </w:tc>
+              <w:tc>
+                <w:tcPr/>
+                <w:p>
+                  <w:pPr>
+                    <w:pStyle w:val="Compact"/>
+                    <w:jc w:val="right"/>
+                    <w:jc w:val="center"/>
+                  </w:pPr>
+                  <w:r>
+                    <w:t xml:space="preserve">7</w:t>
+                  </w:r>
+                </w:p>
+              </w:tc>
+              <w:tc>
+                <w:tcPr/>
+                <w:p>
+                  <w:pPr>
+                    <w:pStyle w:val="Compact"/>
+                    <w:jc w:val="right"/>
+                    <w:jc w:val="center"/>
+                  </w:pPr>
+                  <w:r>
+                    <w:t xml:space="preserve">8</w:t>
+                  </w:r>
+                </w:p>
+              </w:tc>
+            </w:tr>
+            <w:tr>
+              <w:tc>
+                <w:tcPr/>
+                <w:p>
+                  <w:pPr>
+                    <w:pStyle w:val="Compact"/>
+                    <w:jc w:val="left"/>
+                    <w:jc w:val="center"/>
+                  </w:pPr>
+                  <w:r>
+                    <w:t xml:space="preserve">1. Pro-env. behavior (composite)</w:t>
+                  </w:r>
+                </w:p>
+              </w:tc>
+              <w:tc>
+                <w:tcPr/>
+                <w:p>
+                  <w:pPr>
+                    <w:pStyle w:val="Compact"/>
+                    <w:jc w:val="right"/>
+                    <w:jc w:val="center"/>
+                  </w:pPr>
+                  <w:r>
+                    <w:t xml:space="preserve">5.52</w:t>
+                  </w:r>
+                </w:p>
+              </w:tc>
+              <w:tc>
+                <w:tcPr/>
+                <w:p>
+                  <w:pPr>
+                    <w:pStyle w:val="Compact"/>
+                    <w:jc w:val="right"/>
+                    <w:jc w:val="center"/>
+                  </w:pPr>
+                  <w:r>
+                    <w:t xml:space="preserve">2.98</w:t>
+                  </w:r>
+                </w:p>
+              </w:tc>
+              <w:tc>
+                <w:tcPr/>
+                <w:p>
+                  <w:pPr>
+                    <w:pStyle w:val="Compact"/>
+                    <w:jc w:val="right"/>
+                    <w:jc w:val="center"/>
+                  </w:pPr>
+                  <w:r>
+                    <w:t xml:space="preserve">0.00</w:t>
+                  </w:r>
+                </w:p>
+              </w:tc>
+              <w:tc>
+                <w:tcPr/>
+                <w:p>
+                  <w:pPr>
+                    <w:pStyle w:val="Compact"/>
+                    <w:jc w:val="right"/>
+                    <w:jc w:val="center"/>
+                  </w:pPr>
+                  <w:r>
+                    <w:t xml:space="preserve">13</w:t>
+                  </w:r>
+                </w:p>
+              </w:tc>
+              <w:tc>
+                <w:tcPr/>
+                <w:p>
+                  <w:pPr>
+                    <w:pStyle w:val="Compact"/>
+                  </w:pPr>
+                </w:p>
+              </w:tc>
+              <w:tc>
+                <w:tcPr/>
+                <w:p>
+                  <w:pPr>
+                    <w:pStyle w:val="Compact"/>
+                  </w:pPr>
+                </w:p>
+              </w:tc>
+              <w:tc>
+                <w:tcPr/>
+                <w:p>
+                  <w:pPr>
+                    <w:pStyle w:val="Compact"/>
+                  </w:pPr>
+                </w:p>
+              </w:tc>
+              <w:tc>
+                <w:tcPr/>
+                <w:p>
+                  <w:pPr>
+                    <w:pStyle w:val="Compact"/>
+                  </w:pPr>
+                </w:p>
+              </w:tc>
+              <w:tc>
+                <w:tcPr/>
+                <w:p>
+                  <w:pPr>
+                    <w:pStyle w:val="Compact"/>
+                  </w:pPr>
+                </w:p>
+              </w:tc>
+              <w:tc>
+                <w:tcPr/>
+                <w:p>
+                  <w:pPr>
+                    <w:pStyle w:val="Compact"/>
+                  </w:pPr>
+                </w:p>
+              </w:tc>
+              <w:tc>
+                <w:tcPr/>
+                <w:p>
+                  <w:pPr>
+                    <w:pStyle w:val="Compact"/>
+                  </w:pPr>
+                </w:p>
+              </w:tc>
+              <w:tc>
+                <w:tcPr/>
+                <w:p>
+                  <w:pPr>
+                    <w:pStyle w:val="Compact"/>
+                  </w:pPr>
+                </w:p>
+              </w:tc>
+            </w:tr>
+            <w:tr>
+              <w:tc>
+                <w:tcPr/>
+                <w:p>
+                  <w:pPr>
+                    <w:pStyle w:val="Compact"/>
+                    <w:jc w:val="left"/>
+                    <w:jc w:val="center"/>
+                  </w:pPr>
+                  <w:r>
+                    <w:t xml:space="preserve">2. Public behavior</w:t>
+                  </w:r>
+                </w:p>
+              </w:tc>
+              <w:tc>
+                <w:tcPr/>
+                <w:p>
+                  <w:pPr>
+                    <w:pStyle w:val="Compact"/>
+                    <w:jc w:val="right"/>
+                    <w:jc w:val="center"/>
+                  </w:pPr>
+                  <w:r>
+                    <w:t xml:space="preserve">1.80</w:t>
+                  </w:r>
+                </w:p>
+              </w:tc>
+              <w:tc>
+                <w:tcPr/>
+                <w:p>
+                  <w:pPr>
+                    <w:pStyle w:val="Compact"/>
+                    <w:jc w:val="right"/>
+                    <w:jc w:val="center"/>
+                  </w:pPr>
+                  <w:r>
+                    <w:t xml:space="preserve">1.92</w:t>
+                  </w:r>
+                </w:p>
+              </w:tc>
+              <w:tc>
+                <w:tcPr/>
+                <w:p>
+                  <w:pPr>
+                    <w:pStyle w:val="Compact"/>
+                    <w:jc w:val="right"/>
+                    <w:jc w:val="center"/>
+                  </w:pPr>
+                  <w:r>
+                    <w:t xml:space="preserve">0.00</w:t>
+                  </w:r>
+                </w:p>
+              </w:tc>
+              <w:tc>
+                <w:tcPr/>
+                <w:p>
+                  <w:pPr>
+                    <w:pStyle w:val="Compact"/>
+                    <w:jc w:val="right"/>
+                    <w:jc w:val="center"/>
+                  </w:pPr>
+                  <w:r>
+                    <w:t xml:space="preserve">7</w:t>
+                  </w:r>
+                </w:p>
+              </w:tc>
+              <w:tc>
+                <w:tcPr/>
+                <w:p>
+                  <w:pPr>
+                    <w:pStyle w:val="Compact"/>
+                    <w:jc w:val="right"/>
+                    <w:jc w:val="center"/>
+                  </w:pPr>
+                  <w:r>
+                    <w:t xml:space="preserve">0.87</w:t>
+                  </w:r>
+                </w:p>
+              </w:tc>
+              <w:tc>
+                <w:tcPr/>
+                <w:p>
+                  <w:pPr>
+                    <w:pStyle w:val="Compact"/>
+                  </w:pPr>
+                </w:p>
+              </w:tc>
+              <w:tc>
+                <w:tcPr/>
+                <w:p>
+                  <w:pPr>
+                    <w:pStyle w:val="Compact"/>
+                  </w:pPr>
+                </w:p>
+              </w:tc>
+              <w:tc>
+                <w:tcPr/>
+                <w:p>
+                  <w:pPr>
+                    <w:pStyle w:val="Compact"/>
+                  </w:pPr>
+                </w:p>
+              </w:tc>
+              <w:tc>
+                <w:tcPr/>
+                <w:p>
+                  <w:pPr>
+                    <w:pStyle w:val="Compact"/>
+                  </w:pPr>
+                </w:p>
+              </w:tc>
+              <w:tc>
+                <w:tcPr/>
+                <w:p>
+                  <w:pPr>
+                    <w:pStyle w:val="Compact"/>
+                  </w:pPr>
+                </w:p>
+              </w:tc>
+              <w:tc>
+                <w:tcPr/>
+                <w:p>
+                  <w:pPr>
+                    <w:pStyle w:val="Compact"/>
+                  </w:pPr>
+                </w:p>
+              </w:tc>
+              <w:tc>
+                <w:tcPr/>
+                <w:p>
+                  <w:pPr>
+                    <w:pStyle w:val="Compact"/>
+                  </w:pPr>
+                </w:p>
+              </w:tc>
+            </w:tr>
+            <w:tr>
+              <w:tc>
+                <w:tcPr/>
+                <w:p>
+                  <w:pPr>
+                    <w:pStyle w:val="Compact"/>
+                    <w:jc w:val="left"/>
+                    <w:jc w:val="center"/>
+                  </w:pPr>
+                  <w:r>
+                    <w:t xml:space="preserve">3. Private behavior</w:t>
+                  </w:r>
+                </w:p>
+              </w:tc>
+              <w:tc>
+                <w:tcPr/>
+                <w:p>
+                  <w:pPr>
+                    <w:pStyle w:val="Compact"/>
+                    <w:jc w:val="right"/>
+                    <w:jc w:val="center"/>
+                  </w:pPr>
+                  <w:r>
+                    <w:t xml:space="preserve">3.60</w:t>
+                  </w:r>
+                </w:p>
+              </w:tc>
+              <w:tc>
+                <w:tcPr/>
+                <w:p>
+                  <w:pPr>
+                    <w:pStyle w:val="Compact"/>
+                    <w:jc w:val="right"/>
+                    <w:jc w:val="center"/>
+                  </w:pPr>
+                  <w:r>
+                    <w:t xml:space="preserve">1.58</w:t>
+                  </w:r>
+                </w:p>
+              </w:tc>
+              <w:tc>
+                <w:tcPr/>
+                <w:p>
+                  <w:pPr>
+                    <w:pStyle w:val="Compact"/>
+                    <w:jc w:val="right"/>
+                    <w:jc w:val="center"/>
+                  </w:pPr>
+                  <w:r>
+                    <w:t xml:space="preserve">0.00</w:t>
+                  </w:r>
+                </w:p>
+              </w:tc>
+              <w:tc>
+                <w:tcPr/>
+                <w:p>
+                  <w:pPr>
+                    <w:pStyle w:val="Compact"/>
+                    <w:jc w:val="right"/>
+                    <w:jc w:val="center"/>
+                  </w:pPr>
+                  <w:r>
+                    <w:t xml:space="preserve">5</w:t>
+                  </w:r>
+                </w:p>
+              </w:tc>
+              <w:tc>
+                <w:tcPr/>
+                <w:p>
+                  <w:pPr>
+                    <w:pStyle w:val="Compact"/>
+                    <w:jc w:val="right"/>
+                    <w:jc w:val="center"/>
+                  </w:pPr>
+                  <w:r>
+                    <w:t xml:space="preserve">0.75</w:t>
+                  </w:r>
+                </w:p>
+              </w:tc>
+              <w:tc>
+                <w:tcPr/>
+                <w:p>
+                  <w:pPr>
+                    <w:pStyle w:val="Compact"/>
+                    <w:jc w:val="right"/>
+                    <w:jc w:val="center"/>
+                  </w:pPr>
+                  <w:r>
+                    <w:t xml:space="preserve">0.33</w:t>
+                  </w:r>
+                </w:p>
+              </w:tc>
+              <w:tc>
+                <w:tcPr/>
+                <w:p>
+                  <w:pPr>
+                    <w:pStyle w:val="Compact"/>
+                  </w:pPr>
+                </w:p>
+              </w:tc>
+              <w:tc>
+                <w:tcPr/>
+                <w:p>
+                  <w:pPr>
+                    <w:pStyle w:val="Compact"/>
+                  </w:pPr>
+                </w:p>
+              </w:tc>
+              <w:tc>
+                <w:tcPr/>
+                <w:p>
+                  <w:pPr>
+                    <w:pStyle w:val="Compact"/>
+                  </w:pPr>
+                </w:p>
+              </w:tc>
+              <w:tc>
+                <w:tcPr/>
+                <w:p>
+                  <w:pPr>
+                    <w:pStyle w:val="Compact"/>
+                  </w:pPr>
+                </w:p>
+              </w:tc>
+              <w:tc>
+                <w:tcPr/>
+                <w:p>
+                  <w:pPr>
+                    <w:pStyle w:val="Compact"/>
+                  </w:pPr>
+                </w:p>
+              </w:tc>
+              <w:tc>
+                <w:tcPr/>
+                <w:p>
+                  <w:pPr>
+                    <w:pStyle w:val="Compact"/>
+                  </w:pPr>
+                </w:p>
+              </w:tc>
+            </w:tr>
+            <w:tr>
+              <w:tc>
+                <w:tcPr/>
+                <w:p>
+                  <w:pPr>
+                    <w:pStyle w:val="Compact"/>
+                    <w:jc w:val="left"/>
+                    <w:jc w:val="center"/>
+                  </w:pPr>
+                  <w:r>
+                    <w:t xml:space="preserve">4. NEP</w:t>
+                  </w:r>
+                </w:p>
+              </w:tc>
+              <w:tc>
+                <w:tcPr/>
+                <w:p>
+                  <w:pPr>
+                    <w:pStyle w:val="Compact"/>
+                    <w:jc w:val="right"/>
+                    <w:jc w:val="center"/>
+                  </w:pPr>
+                  <w:r>
+                    <w:t xml:space="preserve">3.43</w:t>
+                  </w:r>
+                </w:p>
+              </w:tc>
+              <w:tc>
+                <w:tcPr/>
+                <w:p>
+                  <w:pPr>
+                    <w:pStyle w:val="Compact"/>
+                    <w:jc w:val="right"/>
+                    <w:jc w:val="center"/>
+                  </w:pPr>
+                  <w:r>
+                    <w:t xml:space="preserve">0.62</w:t>
+                  </w:r>
+                </w:p>
+              </w:tc>
+              <w:tc>
+                <w:tcPr/>
+                <w:p>
+                  <w:pPr>
+                    <w:pStyle w:val="Compact"/>
+                    <w:jc w:val="right"/>
+                    <w:jc w:val="center"/>
+                  </w:pPr>
+                  <w:r>
+                    <w:t xml:space="preserve">1.40</w:t>
+                  </w:r>
+                </w:p>
+              </w:tc>
+              <w:tc>
+                <w:tcPr/>
+                <w:p>
+                  <w:pPr>
+                    <w:pStyle w:val="Compact"/>
+                    <w:jc w:val="right"/>
+                    <w:jc w:val="center"/>
+                  </w:pPr>
+                  <w:r>
+                    <w:t xml:space="preserve">5</w:t>
+                  </w:r>
+                </w:p>
+              </w:tc>
+              <w:tc>
+                <w:tcPr/>
+                <w:p>
+                  <w:pPr>
+                    <w:pStyle w:val="Compact"/>
+                    <w:jc w:val="right"/>
+                    <w:jc w:val="center"/>
+                  </w:pPr>
+                  <w:r>
+                    <w:t xml:space="preserve">0.26</w:t>
+                  </w:r>
+                </w:p>
+              </w:tc>
+              <w:tc>
+                <w:tcPr/>
+                <w:p>
+                  <w:pPr>
+                    <w:pStyle w:val="Compact"/>
+                    <w:jc w:val="right"/>
+                    <w:jc w:val="center"/>
+                  </w:pPr>
+                  <w:r>
+                    <w:t xml:space="preserve">0.17</w:t>
+                  </w:r>
+                </w:p>
+              </w:tc>
+              <w:tc>
+                <w:tcPr/>
+                <w:p>
+                  <w:pPr>
+                    <w:pStyle w:val="Compact"/>
+                    <w:jc w:val="right"/>
+                    <w:jc w:val="center"/>
+                  </w:pPr>
+                  <w:r>
+                    <w:t xml:space="preserve">0.30</w:t>
+                  </w:r>
+                </w:p>
+              </w:tc>
+              <w:tc>
+                <w:tcPr/>
+                <w:p>
+                  <w:pPr>
+                    <w:pStyle w:val="Compact"/>
+                  </w:pPr>
+                </w:p>
+              </w:tc>
+              <w:tc>
+                <w:tcPr/>
+                <w:p>
+                  <w:pPr>
+                    <w:pStyle w:val="Compact"/>
+                  </w:pPr>
+                </w:p>
+              </w:tc>
+              <w:tc>
+                <w:tcPr/>
+                <w:p>
+                  <w:pPr>
+                    <w:pStyle w:val="Compact"/>
+                  </w:pPr>
+                </w:p>
+              </w:tc>
+              <w:tc>
+                <w:tcPr/>
+                <w:p>
+                  <w:pPr>
+                    <w:pStyle w:val="Compact"/>
+                  </w:pPr>
+                </w:p>
+              </w:tc>
+              <w:tc>
+                <w:tcPr/>
+                <w:p>
+                  <w:pPr>
+                    <w:pStyle w:val="Compact"/>
+                  </w:pPr>
+                </w:p>
+              </w:tc>
+            </w:tr>
+            <w:tr>
+              <w:tc>
+                <w:tcPr/>
+                <w:p>
+                  <w:pPr>
+                    <w:pStyle w:val="Compact"/>
+                    <w:jc w:val="left"/>
+                    <w:jc w:val="center"/>
+                  </w:pPr>
+                  <w:r>
+                    <w:t xml:space="preserve">5. CNS</w:t>
+                  </w:r>
+                </w:p>
+              </w:tc>
+              <w:tc>
+                <w:tcPr/>
+                <w:p>
+                  <w:pPr>
+                    <w:pStyle w:val="Compact"/>
+                    <w:jc w:val="right"/>
+                    <w:jc w:val="center"/>
+                  </w:pPr>
+                  <w:r>
+                    <w:t xml:space="preserve">3.54</w:t>
+                  </w:r>
+                </w:p>
+              </w:tc>
+              <w:tc>
+                <w:tcPr/>
+                <w:p>
+                  <w:pPr>
+                    <w:pStyle w:val="Compact"/>
+                    <w:jc w:val="right"/>
+                    <w:jc w:val="center"/>
+                  </w:pPr>
+                  <w:r>
+                    <w:t xml:space="preserve">0.53</w:t>
+                  </w:r>
+                </w:p>
+              </w:tc>
+              <w:tc>
+                <w:tcPr/>
+                <w:p>
+                  <w:pPr>
+                    <w:pStyle w:val="Compact"/>
+                    <w:jc w:val="right"/>
+                    <w:jc w:val="center"/>
+                  </w:pPr>
+                  <w:r>
+                    <w:t xml:space="preserve">1.71</w:t>
+                  </w:r>
+                </w:p>
+              </w:tc>
+              <w:tc>
+                <w:tcPr/>
+                <w:p>
+                  <w:pPr>
+                    <w:pStyle w:val="Compact"/>
+                    <w:jc w:val="right"/>
+                    <w:jc w:val="center"/>
+                  </w:pPr>
+                  <w:r>
+                    <w:t xml:space="preserve">5</w:t>
+                  </w:r>
+                </w:p>
+              </w:tc>
+              <w:tc>
+                <w:tcPr/>
+                <w:p>
+                  <w:pPr>
+                    <w:pStyle w:val="Compact"/>
+                    <w:jc w:val="right"/>
+                    <w:jc w:val="center"/>
+                  </w:pPr>
+                  <w:r>
+                    <w:t xml:space="preserve">0.46</w:t>
+                  </w:r>
+                </w:p>
+              </w:tc>
+              <w:tc>
+                <w:tcPr/>
+                <w:p>
+                  <w:pPr>
+                    <w:pStyle w:val="Compact"/>
+                    <w:jc w:val="right"/>
+                    <w:jc w:val="center"/>
+                  </w:pPr>
+                  <w:r>
+                    <w:t xml:space="preserve">0.36</w:t>
+                  </w:r>
+                </w:p>
+              </w:tc>
+              <w:tc>
+                <w:tcPr/>
+                <w:p>
+                  <w:pPr>
+                    <w:pStyle w:val="Compact"/>
+                    <w:jc w:val="right"/>
+                    <w:jc w:val="center"/>
+                  </w:pPr>
+                  <w:r>
+                    <w:t xml:space="preserve">0.43</w:t>
+                  </w:r>
+                </w:p>
+              </w:tc>
+              <w:tc>
+                <w:tcPr/>
+                <w:p>
+                  <w:pPr>
+                    <w:pStyle w:val="Compact"/>
+                    <w:jc w:val="right"/>
+                    <w:jc w:val="center"/>
+                  </w:pPr>
+                  <w:r>
+                    <w:t xml:space="preserve">0.45</w:t>
+                  </w:r>
+                </w:p>
+              </w:tc>
+              <w:tc>
+                <w:tcPr/>
+                <w:p>
+                  <w:pPr>
+                    <w:pStyle w:val="Compact"/>
+                  </w:pPr>
+                </w:p>
+              </w:tc>
+              <w:tc>
+                <w:tcPr/>
+                <w:p>
+                  <w:pPr>
+                    <w:pStyle w:val="Compact"/>
+                  </w:pPr>
+                </w:p>
+              </w:tc>
+              <w:tc>
+                <w:tcPr/>
+                <w:p>
+                  <w:pPr>
+                    <w:pStyle w:val="Compact"/>
+                  </w:pPr>
+                </w:p>
+              </w:tc>
+              <w:tc>
+                <w:tcPr/>
+                <w:p>
+                  <w:pPr>
+                    <w:pStyle w:val="Compact"/>
+                  </w:pPr>
+                </w:p>
+              </w:tc>
+            </w:tr>
+            <w:tr>
+              <w:tc>
+                <w:tcPr/>
+                <w:p>
+                  <w:pPr>
+                    <w:pStyle w:val="Compact"/>
+                    <w:jc w:val="left"/>
+                    <w:jc w:val="center"/>
+                  </w:pPr>
+                  <w:r>
+                    <w:t xml:space="preserve">6. Ideology (lib-con)</w:t>
+                  </w:r>
+                </w:p>
+              </w:tc>
+              <w:tc>
+                <w:tcPr/>
+                <w:p>
+                  <w:pPr>
+                    <w:pStyle w:val="Compact"/>
+                    <w:jc w:val="right"/>
+                    <w:jc w:val="center"/>
+                  </w:pPr>
+                  <w:r>
+                    <w:t xml:space="preserve">3.84</w:t>
+                  </w:r>
+                </w:p>
+              </w:tc>
+              <w:tc>
+                <w:tcPr/>
+                <w:p>
+                  <w:pPr>
+                    <w:pStyle w:val="Compact"/>
+                    <w:jc w:val="right"/>
+                    <w:jc w:val="center"/>
+                  </w:pPr>
+                  <w:r>
+                    <w:t xml:space="preserve">1.62</w:t>
+                  </w:r>
+                </w:p>
+              </w:tc>
+              <w:tc>
+                <w:tcPr/>
+                <w:p>
+                  <w:pPr>
+                    <w:pStyle w:val="Compact"/>
+                    <w:jc w:val="right"/>
+                    <w:jc w:val="center"/>
+                  </w:pPr>
+                  <w:r>
+                    <w:t xml:space="preserve">1.00</w:t>
+                  </w:r>
+                </w:p>
+              </w:tc>
+              <w:tc>
+                <w:tcPr/>
+                <w:p>
+                  <w:pPr>
+                    <w:pStyle w:val="Compact"/>
+                    <w:jc w:val="right"/>
+                    <w:jc w:val="center"/>
+                  </w:pPr>
+                  <w:r>
+                    <w:t xml:space="preserve">7</w:t>
+                  </w:r>
+                </w:p>
+              </w:tc>
+              <w:tc>
+                <w:tcPr/>
+                <w:p>
+                  <w:pPr>
+                    <w:pStyle w:val="Compact"/>
+                    <w:jc w:val="right"/>
+                    <w:jc w:val="center"/>
+                  </w:pPr>
+                  <w:r>
+                    <w:t xml:space="preserve">-0.28</w:t>
+                  </w:r>
+                </w:p>
+              </w:tc>
+              <w:tc>
+                <w:tcPr/>
+                <w:p>
+                  <w:pPr>
+                    <w:pStyle w:val="Compact"/>
+                    <w:jc w:val="right"/>
+                    <w:jc w:val="center"/>
+                  </w:pPr>
+                  <w:r>
+                    <w:t xml:space="preserve">-0.28</w:t>
+                  </w:r>
+                </w:p>
+              </w:tc>
+              <w:tc>
+                <w:tcPr/>
+                <w:p>
+                  <w:pPr>
+                    <w:pStyle w:val="Compact"/>
+                    <w:jc w:val="right"/>
+                    <w:jc w:val="center"/>
+                  </w:pPr>
+                  <w:r>
+                    <w:t xml:space="preserve">-0.17</w:t>
+                  </w:r>
+                </w:p>
+              </w:tc>
+              <w:tc>
+                <w:tcPr/>
+                <w:p>
+                  <w:pPr>
+                    <w:pStyle w:val="Compact"/>
+                    <w:jc w:val="right"/>
+                    <w:jc w:val="center"/>
+                  </w:pPr>
+                  <w:r>
+                    <w:t xml:space="preserve">-0.37</w:t>
+                  </w:r>
+                </w:p>
+              </w:tc>
+              <w:tc>
+                <w:tcPr/>
+                <w:p>
+                  <w:pPr>
+                    <w:pStyle w:val="Compact"/>
+                    <w:jc w:val="right"/>
+                    <w:jc w:val="center"/>
+                  </w:pPr>
+                  <w:r>
+                    <w:t xml:space="preserve">-0.26</w:t>
+                  </w:r>
+                </w:p>
+              </w:tc>
+              <w:tc>
+                <w:tcPr/>
+                <w:p>
+                  <w:pPr>
+                    <w:pStyle w:val="Compact"/>
+                  </w:pPr>
+                </w:p>
+              </w:tc>
+              <w:tc>
+                <w:tcPr/>
+                <w:p>
+                  <w:pPr>
+                    <w:pStyle w:val="Compact"/>
+                  </w:pPr>
+                </w:p>
+              </w:tc>
+              <w:tc>
+                <w:tcPr/>
+                <w:p>
+                  <w:pPr>
+                    <w:pStyle w:val="Compact"/>
+                  </w:pPr>
+                </w:p>
+              </w:tc>
+            </w:tr>
+            <w:tr>
+              <w:tc>
+                <w:tcPr/>
+                <w:p>
+                  <w:pPr>
+                    <w:pStyle w:val="Compact"/>
+                    <w:jc w:val="left"/>
+                    <w:jc w:val="center"/>
+                  </w:pPr>
+                  <w:r>
+                    <w:t xml:space="preserve">7. Environmentalist identity</w:t>
+                  </w:r>
+                </w:p>
+              </w:tc>
+              <w:tc>
+                <w:tcPr/>
+                <w:p>
+                  <w:pPr>
+                    <w:pStyle w:val="Compact"/>
+                    <w:jc w:val="right"/>
+                    <w:jc w:val="center"/>
+                  </w:pPr>
+                  <w:r>
+                    <w:t xml:space="preserve">0.24</w:t>
+                  </w:r>
+                </w:p>
+              </w:tc>
+              <w:tc>
+                <w:tcPr/>
+                <w:p>
+                  <w:pPr>
+                    <w:pStyle w:val="Compact"/>
+                    <w:jc w:val="right"/>
+                    <w:jc w:val="center"/>
+                  </w:pPr>
+                  <w:r>
+                    <w:t xml:space="preserve">0.43</w:t>
+                  </w:r>
+                </w:p>
+              </w:tc>
+              <w:tc>
+                <w:tcPr/>
+                <w:p>
+                  <w:pPr>
+                    <w:pStyle w:val="Compact"/>
+                    <w:jc w:val="right"/>
+                    <w:jc w:val="center"/>
+                  </w:pPr>
+                  <w:r>
+                    <w:t xml:space="preserve">0.00</w:t>
+                  </w:r>
+                </w:p>
+              </w:tc>
+              <w:tc>
+                <w:tcPr/>
+                <w:p>
+                  <w:pPr>
+                    <w:pStyle w:val="Compact"/>
+                    <w:jc w:val="right"/>
+                    <w:jc w:val="center"/>
+                  </w:pPr>
+                  <w:r>
+                    <w:t xml:space="preserve">1</w:t>
+                  </w:r>
+                </w:p>
+              </w:tc>
+              <w:tc>
+                <w:tcPr/>
+                <w:p>
+                  <w:pPr>
+                    <w:pStyle w:val="Compact"/>
+                    <w:jc w:val="right"/>
+                    <w:jc w:val="center"/>
+                  </w:pPr>
+                  <w:r>
+                    <w:t xml:space="preserve">0.43</w:t>
+                  </w:r>
+                </w:p>
+              </w:tc>
+              <w:tc>
+                <w:tcPr/>
+                <w:p>
+                  <w:pPr>
+                    <w:pStyle w:val="Compact"/>
+                    <w:jc w:val="right"/>
+                    <w:jc w:val="center"/>
+                  </w:pPr>
+                  <w:r>
+                    <w:t xml:space="preserve">0.46</w:t>
+                  </w:r>
+                </w:p>
+              </w:tc>
+              <w:tc>
+                <w:tcPr/>
+                <w:p>
+                  <w:pPr>
+                    <w:pStyle w:val="Compact"/>
+                    <w:jc w:val="right"/>
+                    <w:jc w:val="center"/>
+                  </w:pPr>
+                  <w:r>
+                    <w:t xml:space="preserve">0.20</w:t>
+                  </w:r>
+                </w:p>
+              </w:tc>
+              <w:tc>
+                <w:tcPr/>
+                <w:p>
+                  <w:pPr>
+                    <w:pStyle w:val="Compact"/>
+                    <w:jc w:val="right"/>
+                    <w:jc w:val="center"/>
+                  </w:pPr>
+                  <w:r>
+                    <w:t xml:space="preserve">0.16</w:t>
+                  </w:r>
+                </w:p>
+              </w:tc>
+              <w:tc>
+                <w:tcPr/>
+                <w:p>
+                  <w:pPr>
+                    <w:pStyle w:val="Compact"/>
+                    <w:jc w:val="right"/>
+                    <w:jc w:val="center"/>
+                  </w:pPr>
+                  <w:r>
+                    <w:t xml:space="preserve">0.32</w:t>
+                  </w:r>
+                </w:p>
+              </w:tc>
+              <w:tc>
+                <w:tcPr/>
+                <w:p>
+                  <w:pPr>
+                    <w:pStyle w:val="Compact"/>
+                    <w:jc w:val="right"/>
+                    <w:jc w:val="center"/>
+                  </w:pPr>
+                  <w:r>
+                    <w:t xml:space="preserve">-0.27</w:t>
+                  </w:r>
+                </w:p>
+              </w:tc>
+              <w:tc>
+                <w:tcPr/>
+                <w:p>
+                  <w:pPr>
+                    <w:pStyle w:val="Compact"/>
+                  </w:pPr>
+                </w:p>
+              </w:tc>
+              <w:tc>
+                <w:tcPr/>
+                <w:p>
+                  <w:pPr>
+                    <w:pStyle w:val="Compact"/>
+                  </w:pPr>
+                </w:p>
+              </w:tc>
+            </w:tr>
+            <w:tr>
+              <w:tc>
+                <w:tcPr/>
+                <w:p>
+                  <w:pPr>
+                    <w:pStyle w:val="Compact"/>
+                    <w:jc w:val="left"/>
+                    <w:jc w:val="center"/>
+                  </w:pPr>
+                  <w:r>
+                    <w:t xml:space="preserve">8. Env. movement identity</w:t>
+                  </w:r>
+                </w:p>
+              </w:tc>
+              <w:tc>
+                <w:tcPr/>
+                <w:p>
+                  <w:pPr>
+                    <w:pStyle w:val="Compact"/>
+                    <w:jc w:val="right"/>
+                    <w:jc w:val="center"/>
+                  </w:pPr>
+                  <w:r>
+                    <w:t xml:space="preserve">2.73</w:t>
+                  </w:r>
+                </w:p>
+              </w:tc>
+              <w:tc>
+                <w:tcPr/>
+                <w:p>
+                  <w:pPr>
+                    <w:pStyle w:val="Compact"/>
+                    <w:jc w:val="right"/>
+                    <w:jc w:val="center"/>
+                  </w:pPr>
+                  <w:r>
+                    <w:t xml:space="preserve">0.74</w:t>
+                  </w:r>
+                </w:p>
+              </w:tc>
+              <w:tc>
+                <w:tcPr/>
+                <w:p>
+                  <w:pPr>
+                    <w:pStyle w:val="Compact"/>
+                    <w:jc w:val="right"/>
+                    <w:jc w:val="center"/>
+                  </w:pPr>
+                  <w:r>
+                    <w:t xml:space="preserve">1.00</w:t>
+                  </w:r>
+                </w:p>
+              </w:tc>
+              <w:tc>
+                <w:tcPr/>
+                <w:p>
+                  <w:pPr>
+                    <w:pStyle w:val="Compact"/>
+                    <w:jc w:val="right"/>
+                    <w:jc w:val="center"/>
+                  </w:pPr>
+                  <w:r>
+                    <w:t xml:space="preserve">4</w:t>
+                  </w:r>
+                </w:p>
+              </w:tc>
+              <w:tc>
+                <w:tcPr/>
+                <w:p>
+                  <w:pPr>
+                    <w:pStyle w:val="Compact"/>
+                    <w:jc w:val="right"/>
+                    <w:jc w:val="center"/>
+                  </w:pPr>
+                  <w:r>
+                    <w:t xml:space="preserve">0.38</w:t>
+                  </w:r>
+                </w:p>
+              </w:tc>
+              <w:tc>
+                <w:tcPr/>
+                <w:p>
+                  <w:pPr>
+                    <w:pStyle w:val="Compact"/>
+                    <w:jc w:val="right"/>
+                    <w:jc w:val="center"/>
+                  </w:pPr>
+                  <w:r>
+                    <w:t xml:space="preserve">0.30</w:t>
+                  </w:r>
+                </w:p>
+              </w:tc>
+              <w:tc>
+                <w:tcPr/>
+                <w:p>
+                  <w:pPr>
+                    <w:pStyle w:val="Compact"/>
+                    <w:jc w:val="right"/>
+                    <w:jc w:val="center"/>
+                  </w:pPr>
+                  <w:r>
+                    <w:t xml:space="preserve">0.35</w:t>
+                  </w:r>
+                </w:p>
+              </w:tc>
+              <w:tc>
+                <w:tcPr/>
+                <w:p>
+                  <w:pPr>
+                    <w:pStyle w:val="Compact"/>
+                    <w:jc w:val="right"/>
+                    <w:jc w:val="center"/>
+                  </w:pPr>
+                  <w:r>
+                    <w:t xml:space="preserve">0.46</w:t>
+                  </w:r>
+                </w:p>
+              </w:tc>
+              <w:tc>
+                <w:tcPr/>
+                <w:p>
+                  <w:pPr>
+                    <w:pStyle w:val="Compact"/>
+                    <w:jc w:val="right"/>
+                    <w:jc w:val="center"/>
+                  </w:pPr>
+                  <w:r>
+                    <w:t xml:space="preserve">0.41</w:t>
+                  </w:r>
+                </w:p>
+              </w:tc>
+              <w:tc>
+                <w:tcPr/>
+                <w:p>
+                  <w:pPr>
+                    <w:pStyle w:val="Compact"/>
+                    <w:jc w:val="right"/>
+                    <w:jc w:val="center"/>
+                  </w:pPr>
+                  <w:r>
+                    <w:t xml:space="preserve">-0.31</w:t>
+                  </w:r>
+                </w:p>
+              </w:tc>
+              <w:tc>
+                <w:tcPr/>
+                <w:p>
+                  <w:pPr>
+                    <w:pStyle w:val="Compact"/>
+                    <w:jc w:val="right"/>
+                    <w:jc w:val="center"/>
+                  </w:pPr>
+                  <w:r>
+                    <w:t xml:space="preserve">0.3</w:t>
+                  </w:r>
+                </w:p>
+              </w:tc>
+              <w:tc>
+                <w:tcPr/>
+                <w:p>
+                  <w:pPr>
+                    <w:pStyle w:val="Compact"/>
+                  </w:pPr>
+                </w:p>
+              </w:tc>
+            </w:tr>
+          </w:tbl>
+          <w:bookmarkEnd w:id="13"/>
+          <w:p/>
+        </w:tc>
+      </w:tr>
+    </w:tbl>
+    <w:bookmarkEnd w:id="14"/>
+    <w:bookmarkStart w:id="27" w:name="results"/>
+    <w:p>
+      <w:pPr>
+        <w:pStyle w:val="Heading2"/>
+      </w:pPr>
+      <w:r>
+        <w:t xml:space="preserve">Results</w:t>
+      </w:r>
+    </w:p>
+    <w:bookmarkStart w:id="19" w:name="environmental-belief-system-network"/>
+    <w:p>
+      <w:pPr>
+        <w:pStyle w:val="Heading3"/>
+      </w:pPr>
+      <w:r>
+        <w:t xml:space="preserve">Environmental Belief System Network</w:t>
+      </w:r>
+    </w:p>
+    <w:tbl>
+      <w:tblPr>
+        <w:tblStyle w:val="Table"/>
+        <w:tblW w:type="pct" w:w="5000"/>
+        <w:tblLayout w:type="fixed"/>
+        <w:tblLook w:firstRow="0" w:lastRow="0" w:firstColumn="0" w:lastColumn="0" w:noHBand="0" w:noVBand="0" w:val="0000"/>
+      </w:tblPr>
+      <w:tblGrid>
+        <w:gridCol w:w="7920"/>
+      </w:tblGrid>
+      <w:tr>
+        <w:tc>
+          <w:tcPr/>
+          <w:bookmarkStart w:id="18" w:name="fig-envNetwork"/>
           <w:p>
             <w:pPr>
               <w:jc w:val="center"/>
@@ -278,18 +1676,18 @@
                 <wp:inline>
                   <wp:extent cx="5334000" cy="4267200"/>
                   <wp:effectExtent b="0" l="0" r="0" t="0"/>
-                  <wp:docPr descr="" title="" id="17" name="Picture"/>
+                  <wp:docPr descr="" title="" id="16" name="Picture"/>
                   <a:graphic>
                     <a:graphicData uri="http://schemas.openxmlformats.org/drawingml/2006/picture">
                       <pic:pic>
                         <pic:nvPicPr>
-                          <pic:cNvPr descr="environ-beliefs_files/figure-docx/fig-envNetwork-1.png" id="18" name="Picture"/>
+                          <pic:cNvPr descr="environ-beliefs_files/figure-docx/fig-envNetwork-1.png" id="17" name="Picture"/>
                           <pic:cNvPicPr>
                             <a:picLocks noChangeArrowheads="1" noChangeAspect="1"/>
                           </pic:cNvPicPr>
                         </pic:nvPicPr>
                         <pic:blipFill>
-                          <a:blip r:embed="rId16"/>
+                          <a:blip r:embed="rId15"/>
                           <a:stretch>
                             <a:fillRect/>
                           </a:stretch>
@@ -316,15 +1714,15 @@
               </w:drawing>
             </w:r>
           </w:p>
-          <w:bookmarkEnd w:id="19"/>
+          <w:bookmarkEnd w:id="18"/>
         </w:tc>
       </w:tr>
     </w:tbl>
-    <w:bookmarkEnd w:id="20"/>
-    <w:bookmarkStart w:id="25" w:name="X529939c2a4a1986931c1ccf9b2f145d9b28852f"/>
+    <w:bookmarkEnd w:id="19"/>
+    <w:bookmarkStart w:id="24" w:name="X529939c2a4a1986931c1ccf9b2f145d9b28852f"/>
     <w:p>
       <w:pPr>
-        <w:pStyle w:val="Heading2"/>
+        <w:pStyle w:val="Heading3"/>
       </w:pPr>
       <w:r>
         <w:t xml:space="preserve">Environmental Belief System Network with Behavior</w:t>
@@ -343,7 +1741,7 @@
       <w:tr>
         <w:tc>
           <w:tcPr/>
-          <w:bookmarkStart w:id="24" w:name="fig-combineNetwork2"/>
+          <w:bookmarkStart w:id="23" w:name="fig-combineNetwork2"/>
           <w:p>
             <w:pPr>
               <w:jc w:val="center"/>
@@ -367,18 +1765,18 @@
                 <wp:inline>
                   <wp:extent cx="5334000" cy="4267200"/>
                   <wp:effectExtent b="0" l="0" r="0" t="0"/>
-                  <wp:docPr descr="" title="" id="22" name="Picture"/>
+                  <wp:docPr descr="" title="" id="21" name="Picture"/>
                   <a:graphic>
                     <a:graphicData uri="http://schemas.openxmlformats.org/drawingml/2006/picture">
                       <pic:pic>
                         <pic:nvPicPr>
-                          <pic:cNvPr descr="environ-beliefs_files/figure-docx/fig-combineNetwork2-1.png" id="23" name="Picture"/>
+                          <pic:cNvPr descr="environ-beliefs_files/figure-docx/fig-combineNetwork2-1.png" id="22" name="Picture"/>
                           <pic:cNvPicPr>
                             <a:picLocks noChangeArrowheads="1" noChangeAspect="1"/>
                           </pic:cNvPicPr>
                         </pic:nvPicPr>
                         <pic:blipFill>
-                          <a:blip r:embed="rId21"/>
+                          <a:blip r:embed="rId20"/>
                           <a:stretch>
                             <a:fillRect/>
                           </a:stretch>
@@ -405,42 +1803,963 @@
               </w:drawing>
             </w:r>
           </w:p>
-          <w:bookmarkEnd w:id="24"/>
+          <w:bookmarkEnd w:id="23"/>
+        </w:tc>
+      </w:tr>
+    </w:tbl>
+    <w:bookmarkEnd w:id="24"/>
+    <w:bookmarkStart w:id="26" w:name="shortest-paths-from-beliefs-to-behavior"/>
+    <w:p>
+      <w:pPr>
+        <w:pStyle w:val="Heading3"/>
+      </w:pPr>
+      <w:r>
+        <w:t xml:space="preserve">Shortest paths from beliefs to behavior</w:t>
+      </w:r>
+    </w:p>
+    <w:tbl>
+      <w:tblPr>
+        <w:tblStyle w:val="Table"/>
+        <w:tblW w:type="pct" w:w="5000"/>
+        <w:tblLayout w:type="fixed"/>
+        <w:tblLook w:firstRow="0" w:lastRow="0" w:firstColumn="0" w:lastColumn="0" w:noHBand="0" w:noVBand="0" w:val="0000"/>
+      </w:tblPr>
+      <w:tblGrid>
+        <w:gridCol w:w="7920"/>
+      </w:tblGrid>
+      <w:tr>
+        <w:tc>
+          <w:tcPr/>
+          <w:bookmarkStart w:id="25" w:name="tbl-spl"/>
+          <w:p>
+            <w:pPr>
+              <w:jc w:val="center"/>
+            </w:pPr>
+            <w:pPr>
+              <w:jc w:val="left"/>
+              <w:spacing w:before="200"/>
+              <w:pStyle w:val="ImageCaption"/>
+            </w:pPr>
+            <w:r>
+              <w:t xml:space="preserve">Table 2: Weighted shortest-path distance (Dijkstra on 1 / |edge weight|) from each belief node to the public and private behavior nodes, with 95 percent bootstrap percentile intervals from 1,000 resamples. Rows ordered by mean distance, and a smaller distance indicates a belief closer to behavior.</w:t>
+            </w:r>
+          </w:p>
+          <w:tbl>
+            <w:tblPr>
+              <w:tblStyle w:val="Table"/>
+              <w:tblW w:type="auto" w:w="0"/>
+              <w:tblLook w:firstRow="1" w:lastRow="0" w:firstColumn="0" w:lastColumn="0" w:noHBand="0" w:noVBand="0" w:val="0020"/>
+            </w:tblPr>
+            <w:tblGrid>
+              <w:gridCol w:w="1980"/>
+              <w:gridCol w:w="1980"/>
+              <w:gridCol w:w="1980"/>
+              <w:gridCol w:w="1980"/>
+            </w:tblGrid>
+            <w:tr>
+              <w:trPr>
+                <w:tblHeader w:val="on"/>
+              </w:trPr>
+              <w:tc>
+                <w:tcPr/>
+                <w:p>
+                  <w:pPr>
+                    <w:pStyle w:val="Compact"/>
+                    <w:jc w:val="left"/>
+                    <w:jc w:val="center"/>
+                  </w:pPr>
+                  <w:r>
+                    <w:t xml:space="preserve">Belief</w:t>
+                  </w:r>
+                </w:p>
+              </w:tc>
+              <w:tc>
+                <w:tcPr/>
+                <w:p>
+                  <w:pPr>
+                    <w:pStyle w:val="Compact"/>
+                    <w:jc w:val="left"/>
+                    <w:jc w:val="center"/>
+                  </w:pPr>
+                  <w:r>
+                    <w:t xml:space="preserve">To public</w:t>
+                  </w:r>
+                </w:p>
+              </w:tc>
+              <w:tc>
+                <w:tcPr/>
+                <w:p>
+                  <w:pPr>
+                    <w:pStyle w:val="Compact"/>
+                    <w:jc w:val="left"/>
+                    <w:jc w:val="center"/>
+                  </w:pPr>
+                  <w:r>
+                    <w:t xml:space="preserve">To private</w:t>
+                  </w:r>
+                </w:p>
+              </w:tc>
+              <w:tc>
+                <w:tcPr/>
+                <w:p>
+                  <w:pPr>
+                    <w:pStyle w:val="Compact"/>
+                    <w:jc w:val="right"/>
+                    <w:jc w:val="center"/>
+                  </w:pPr>
+                  <w:r>
+                    <w:t xml:space="preserve">Mean distance</w:t>
+                  </w:r>
+                </w:p>
+              </w:tc>
+            </w:tr>
+            <w:tr>
+              <w:tc>
+                <w:tcPr/>
+                <w:p>
+                  <w:pPr>
+                    <w:pStyle w:val="Compact"/>
+                    <w:jc w:val="left"/>
+                    <w:jc w:val="center"/>
+                  </w:pPr>
+                  <w:r>
+                    <w:t xml:space="preserve">environmentalist</w:t>
+                  </w:r>
+                </w:p>
+              </w:tc>
+              <w:tc>
+                <w:tcPr/>
+                <w:p>
+                  <w:pPr>
+                    <w:pStyle w:val="Compact"/>
+                    <w:jc w:val="left"/>
+                    <w:jc w:val="center"/>
+                  </w:pPr>
+                  <w:r>
+                    <w:t xml:space="preserve">2.7 [2.3, 3.5]</w:t>
+                  </w:r>
+                </w:p>
+              </w:tc>
+              <w:tc>
+                <w:tcPr/>
+                <w:p>
+                  <w:pPr>
+                    <w:pStyle w:val="Compact"/>
+                    <w:jc w:val="left"/>
+                    <w:jc w:val="center"/>
+                  </w:pPr>
+                  <w:r>
+                    <w:t xml:space="preserve">7.3 [6.2, 8.6]</w:t>
+                  </w:r>
+                </w:p>
+              </w:tc>
+              <w:tc>
+                <w:tcPr/>
+                <w:p>
+                  <w:pPr>
+                    <w:pStyle w:val="Compact"/>
+                    <w:jc w:val="right"/>
+                    <w:jc w:val="center"/>
+                  </w:pPr>
+                  <w:r>
+                    <w:t xml:space="preserve">5.0</w:t>
+                  </w:r>
+                </w:p>
+              </w:tc>
+            </w:tr>
+            <w:tr>
+              <w:tc>
+                <w:tcPr/>
+                <w:p>
+                  <w:pPr>
+                    <w:pStyle w:val="Compact"/>
+                    <w:jc w:val="left"/>
+                    <w:jc w:val="center"/>
+                  </w:pPr>
+                  <w:r>
+                    <w:t xml:space="preserve">CNS</w:t>
+                  </w:r>
+                </w:p>
+              </w:tc>
+              <w:tc>
+                <w:tcPr/>
+                <w:p>
+                  <w:pPr>
+                    <w:pStyle w:val="Compact"/>
+                    <w:jc w:val="left"/>
+                    <w:jc w:val="center"/>
+                  </w:pPr>
+                  <w:r>
+                    <w:t xml:space="preserve">7.0 [5.8, 8.8]</w:t>
+                  </w:r>
+                </w:p>
+              </w:tc>
+              <w:tc>
+                <w:tcPr/>
+                <w:p>
+                  <w:pPr>
+                    <w:pStyle w:val="Compact"/>
+                    <w:jc w:val="left"/>
+                    <w:jc w:val="center"/>
+                  </w:pPr>
+                  <w:r>
+                    <w:t xml:space="preserve">3.8 [3.1, 5.2]</w:t>
+                  </w:r>
+                </w:p>
+              </w:tc>
+              <w:tc>
+                <w:tcPr/>
+                <w:p>
+                  <w:pPr>
+                    <w:pStyle w:val="Compact"/>
+                    <w:jc w:val="right"/>
+                    <w:jc w:val="center"/>
+                  </w:pPr>
+                  <w:r>
+                    <w:t xml:space="preserve">5.4</w:t>
+                  </w:r>
+                </w:p>
+              </w:tc>
+            </w:tr>
+            <w:tr>
+              <w:tc>
+                <w:tcPr/>
+                <w:p>
+                  <w:pPr>
+                    <w:pStyle w:val="Compact"/>
+                    <w:jc w:val="left"/>
+                    <w:jc w:val="center"/>
+                  </w:pPr>
+                  <w:r>
+                    <w:t xml:space="preserve">enviro.move</w:t>
+                  </w:r>
+                </w:p>
+              </w:tc>
+              <w:tc>
+                <w:tcPr/>
+                <w:p>
+                  <w:pPr>
+                    <w:pStyle w:val="Compact"/>
+                    <w:jc w:val="left"/>
+                    <w:jc w:val="center"/>
+                  </w:pPr>
+                  <w:r>
+                    <w:t xml:space="preserve">7.2 [5.8, 10.3]</w:t>
+                  </w:r>
+                </w:p>
+              </w:tc>
+              <w:tc>
+                <w:tcPr/>
+                <w:p>
+                  <w:pPr>
+                    <w:pStyle w:val="Compact"/>
+                    <w:jc w:val="left"/>
+                    <w:jc w:val="center"/>
+                  </w:pPr>
+                  <w:r>
+                    <w:t xml:space="preserve">5.4 [4.0, 9.2]</w:t>
+                  </w:r>
+                </w:p>
+              </w:tc>
+              <w:tc>
+                <w:tcPr/>
+                <w:p>
+                  <w:pPr>
+                    <w:pStyle w:val="Compact"/>
+                    <w:jc w:val="right"/>
+                    <w:jc w:val="center"/>
+                  </w:pPr>
+                  <w:r>
+                    <w:t xml:space="preserve">6.3</w:t>
+                  </w:r>
+                </w:p>
+              </w:tc>
+            </w:tr>
+            <w:tr>
+              <w:tc>
+                <w:tcPr/>
+                <w:p>
+                  <w:pPr>
+                    <w:pStyle w:val="Compact"/>
+                    <w:jc w:val="left"/>
+                    <w:jc w:val="center"/>
+                  </w:pPr>
+                  <w:r>
+                    <w:t xml:space="preserve">NEP</w:t>
+                  </w:r>
+                </w:p>
+              </w:tc>
+              <w:tc>
+                <w:tcPr/>
+                <w:p>
+                  <w:pPr>
+                    <w:pStyle w:val="Compact"/>
+                    <w:jc w:val="left"/>
+                    <w:jc w:val="center"/>
+                  </w:pPr>
+                  <w:r>
+                    <w:t xml:space="preserve">10.5 [7.5, 11.9]</w:t>
+                  </w:r>
+                </w:p>
+              </w:tc>
+              <w:tc>
+                <w:tcPr/>
+                <w:p>
+                  <w:pPr>
+                    <w:pStyle w:val="Compact"/>
+                    <w:jc w:val="left"/>
+                    <w:jc w:val="center"/>
+                  </w:pPr>
+                  <w:r>
+                    <w:t xml:space="preserve">7.7 [6.4, 8.8]</w:t>
+                  </w:r>
+                </w:p>
+              </w:tc>
+              <w:tc>
+                <w:tcPr/>
+                <w:p>
+                  <w:pPr>
+                    <w:pStyle w:val="Compact"/>
+                    <w:jc w:val="right"/>
+                    <w:jc w:val="center"/>
+                  </w:pPr>
+                  <w:r>
+                    <w:t xml:space="preserve">9.1</w:t>
+                  </w:r>
+                </w:p>
+              </w:tc>
+            </w:tr>
+            <w:tr>
+              <w:tc>
+                <w:tcPr/>
+                <w:p>
+                  <w:pPr>
+                    <w:pStyle w:val="Compact"/>
+                    <w:jc w:val="left"/>
+                    <w:jc w:val="center"/>
+                  </w:pPr>
+                  <w:r>
+                    <w:t xml:space="preserve">Ideology</w:t>
+                  </w:r>
+                </w:p>
+              </w:tc>
+              <w:tc>
+                <w:tcPr/>
+                <w:p>
+                  <w:pPr>
+                    <w:pStyle w:val="Compact"/>
+                    <w:jc w:val="left"/>
+                    <w:jc w:val="center"/>
+                  </w:pPr>
+                  <w:r>
+                    <w:t xml:space="preserve">7.8 [5.7, 10.3]</w:t>
+                  </w:r>
+                </w:p>
+              </w:tc>
+              <w:tc>
+                <w:tcPr/>
+                <w:p>
+                  <w:pPr>
+                    <w:pStyle w:val="Compact"/>
+                    <w:jc w:val="left"/>
+                    <w:jc w:val="center"/>
+                  </w:pPr>
+                  <w:r>
+                    <w:t xml:space="preserve">11.6 [8.2, 13.0]</w:t>
+                  </w:r>
+                </w:p>
+              </w:tc>
+              <w:tc>
+                <w:tcPr/>
+                <w:p>
+                  <w:pPr>
+                    <w:pStyle w:val="Compact"/>
+                    <w:jc w:val="right"/>
+                    <w:jc w:val="center"/>
+                  </w:pPr>
+                  <w:r>
+                    <w:t xml:space="preserve">9.7</w:t>
+                  </w:r>
+                </w:p>
+              </w:tc>
+            </w:tr>
+          </w:tbl>
+          <w:bookmarkEnd w:id="25"/>
+          <w:p/>
+        </w:tc>
+      </w:tr>
+    </w:tbl>
+    <w:bookmarkEnd w:id="26"/>
+    <w:bookmarkEnd w:id="27"/>
+    <w:bookmarkEnd w:id="28"/>
+    <w:bookmarkStart w:id="36" w:name="study-2"/>
+    <w:p>
+      <w:pPr>
+        <w:pStyle w:val="Heading1"/>
+      </w:pPr>
+      <w:r>
+        <w:t xml:space="preserve">Study 2</w:t>
+      </w:r>
+    </w:p>
+    <w:bookmarkStart w:id="29" w:name="data-and-measures-1"/>
+    <w:p>
+      <w:pPr>
+        <w:pStyle w:val="Heading2"/>
+      </w:pPr>
+      <w:r>
+        <w:t xml:space="preserve">Data and Measures</w:t>
+      </w:r>
+    </w:p>
+    <w:p>
+      <w:pPr>
+        <w:pStyle w:val="FirstParagraph"/>
+      </w:pPr>
+      <w:r>
+        <w:t xml:space="preserve">For the second study I use data from the 2020 wave of the International Social Survey Programme (ISSP) environment module, which surveyed 44,100 respondents across 28 countries. The module repeats a set of environmental attitude and behavior items that have been fielded since 1993, and it allows the belief network approach to be examined outside the United States.</w:t>
+      </w:r>
+    </w:p>
+    <w:p>
+      <w:pPr>
+        <w:pStyle w:val="BodyText"/>
+      </w:pPr>
+      <w:r>
+        <w:t xml:space="preserve">The ISSP does not include the NEP or CNS scales, so I construct comparable belief measures from the module’s attitude items. Using exploratory graph analysis I identify four belief dimensions and score each as the mean of its items, oriented so that higher values indicate more pro-environmental positions. Environmental commitment combines concern about the environment with willingness to pay higher prices and taxes and a personal norm to act (α = 0.75). Ecological worldview captures low environmental and climate-change skepticism and is the closest available analog to the NEP (α = 0.76). Perceived threat is the mean of seven items rating the danger posed by specific environmental hazards (α = 0.80). Nature affinity combines enjoyment of nature with the frequency of outdoor leisure and is a thin analog to the CNS (α = 0.61). I also include a left-right ideology measure based on the party the respondent reports voting for. The supplemental materials describe the scale construction.</w:t>
+      </w:r>
+    </w:p>
+    <w:p>
+      <w:pPr>
+        <w:pStyle w:val="BodyText"/>
+      </w:pPr>
+      <w:r>
+        <w:t xml:space="preserve">The dependent variable is again pro-environmental behavior, measured with the same public and private distinction used in Study 1. The ISSP asks about six behaviors with a close counterpart in the 2000 Gallup items. Public behavior is a count of four collective actions, membership in an environmental group, signing a petition, donating money, and taking part in a protest. Private behavior is a count of two household actions, recycling and avoiding environmentally harmful products. Exploratory graph analysis of the six items recovers this public-private grouping.</w:t>
+      </w:r>
+    </w:p>
+    <w:bookmarkEnd w:id="29"/>
+    <w:bookmarkStart w:id="35" w:name="results-1"/>
+    <w:p>
+      <w:pPr>
+        <w:pStyle w:val="Heading2"/>
+      </w:pPr>
+      <w:r>
+        <w:t xml:space="preserve">Results</w:t>
+      </w:r>
+    </w:p>
+    <w:p>
+      <w:pPr>
+        <w:pStyle w:val="FirstParagraph"/>
+      </w:pPr>
+      <w:r>
+        <w:t xml:space="preserve">I estimate a separate belief network for each of the 28 countries, following the Study 1 procedure, and compute the shortest path from each belief to the public and private behavior nodes. Figure 3 shows the networks for four countries that span the range of results. In Switzerland, the typical case, environmental commitment is closest to behavior. In the United States the ordering is close to a three-way tie among environmental commitment, ideology, and nature affinity. India and Australia are the two countries where a different belief, nature affinity and ideology respectively, has the shortest path.</w:t>
+      </w:r>
+    </w:p>
+    <w:p>
+      <w:pPr>
+        <w:pStyle w:val="BodyText"/>
+      </w:pPr>
+      <w:r>
+        <w:t xml:space="preserve">Table 3 reports the mean rank of each belief across countries, where a rank of one identifies the belief closest to behavior in a given country. The pattern matches Study 1. Environmental commitment has the shortest mean path to behavior in 24 of 28 countries, and ecological worldview is next. Perceived threat, nature affinity, and ideology are peripheral. A nonparametric bootstrap with 1,000 resamples per country shows that this ordering is stable. The belief identified as closest holds in a majority of resamples in 27 of 28 countries, so the cross-country regularity is not an artifact of a few unstable networks.</w:t>
+      </w:r>
+    </w:p>
+    <w:tbl>
+      <w:tblPr>
+        <w:tblStyle w:val="Table"/>
+        <w:tblW w:type="pct" w:w="5000"/>
+        <w:tblLayout w:type="fixed"/>
+        <w:tblLook w:firstRow="0" w:lastRow="0" w:firstColumn="0" w:lastColumn="0" w:noHBand="0" w:noVBand="0" w:val="0000"/>
+      </w:tblPr>
+      <w:tblGrid>
+        <w:gridCol w:w="7920"/>
+      </w:tblGrid>
+      <w:tr>
+        <w:tc>
+          <w:tcPr/>
+          <w:bookmarkStart w:id="33" w:name="fig-issp-networks"/>
+          <w:p>
+            <w:pPr>
+              <w:jc w:val="center"/>
+            </w:pPr>
+            <w:pPr>
+              <w:jc w:val="left"/>
+              <w:spacing w:before="200"/>
+              <w:pStyle w:val="ImageCaption"/>
+            </w:pPr>
+            <w:r>
+              <w:t xml:space="preserve">Figure 3: Belief networks for four illustrative Study 2 countries. Blue nodes are the belief measures (commit = environmental commitment, world = ecological worldview, threat = perceived threat, nature = nature affinity, L-R = left-right ideology), orange nodes are the public and private behavior indices. Solid edges are positive regularized partial correlations and dashed edges negative, with thicker edges indicating stronger associations.</w:t>
+            </w:r>
+          </w:p>
+          <w:p>
+            <w:pPr>
+              <w:pStyle w:val="Compact"/>
+              <w:jc w:val="center"/>
+            </w:pPr>
+            <w:r>
+              <w:drawing>
+                <wp:inline>
+                  <wp:extent cx="5334000" cy="5334000"/>
+                  <wp:effectExtent b="0" l="0" r="0" t="0"/>
+                  <wp:docPr descr="" title="" id="31" name="Picture"/>
+                  <a:graphic>
+                    <a:graphicData uri="http://schemas.openxmlformats.org/drawingml/2006/picture">
+                      <pic:pic>
+                        <pic:nvPicPr>
+                          <pic:cNvPr descr="environ-beliefs_files/figure-docx/fig-issp-networks-1.png" id="32" name="Picture"/>
+                          <pic:cNvPicPr>
+                            <a:picLocks noChangeArrowheads="1" noChangeAspect="1"/>
+                          </pic:cNvPicPr>
+                        </pic:nvPicPr>
+                        <pic:blipFill>
+                          <a:blip r:embed="rId30"/>
+                          <a:stretch>
+                            <a:fillRect/>
+                          </a:stretch>
+                        </pic:blipFill>
+                        <pic:spPr bwMode="auto">
+                          <a:xfrm>
+                            <a:off x="0" y="0"/>
+                            <a:ext cx="5334000" cy="5334000"/>
+                          </a:xfrm>
+                          <a:prstGeom prst="rect">
+                            <a:avLst/>
+                          </a:prstGeom>
+                          <a:noFill/>
+                          <a:ln w="9525">
+                            <a:noFill/>
+                            <a:headEnd/>
+                            <a:tailEnd/>
+                          </a:ln>
+                        </pic:spPr>
+                      </pic:pic>
+                    </a:graphicData>
+                  </a:graphic>
+                </wp:inline>
+              </w:drawing>
+            </w:r>
+          </w:p>
+          <w:bookmarkEnd w:id="33"/>
+        </w:tc>
+      </w:tr>
+    </w:tbl>
+    <w:tbl>
+      <w:tblPr>
+        <w:tblStyle w:val="Table"/>
+        <w:tblW w:type="pct" w:w="5000"/>
+        <w:tblLayout w:type="fixed"/>
+        <w:tblLook w:firstRow="0" w:lastRow="0" w:firstColumn="0" w:lastColumn="0" w:noHBand="0" w:noVBand="0" w:val="0000"/>
+      </w:tblPr>
+      <w:tblGrid>
+        <w:gridCol w:w="7920"/>
+      </w:tblGrid>
+      <w:tr>
+        <w:tc>
+          <w:tcPr/>
+          <w:bookmarkStart w:id="34" w:name="tbl-issp-results"/>
+          <w:p>
+            <w:pPr>
+              <w:jc w:val="center"/>
+            </w:pPr>
+            <w:pPr>
+              <w:jc w:val="left"/>
+              <w:spacing w:before="200"/>
+              <w:pStyle w:val="ImageCaption"/>
+            </w:pPr>
+            <w:r>
+              <w:t xml:space="preserve">Table 3: Mean rank of each Study 2 belief across the 28 ISSP countries (1 = closest to behavior).</w:t>
+            </w:r>
+            <w:r>
+              <w:t xml:space="preserve"> </w:t>
+            </w:r>
+            <w:r>
+              <w:t xml:space="preserve">‘Closest in’</w:t>
+            </w:r>
+            <w:r>
+              <w:t xml:space="preserve"> </w:t>
+            </w:r>
+            <w:r>
+              <w:t xml:space="preserve">counts the countries where the belief has the shortest mean path to behavior, and</w:t>
+            </w:r>
+            <w:r>
+              <w:t xml:space="preserve"> </w:t>
+            </w:r>
+            <w:r>
+              <w:t xml:space="preserve">‘bootstrap-supported’</w:t>
+            </w:r>
+            <w:r>
+              <w:t xml:space="preserve"> </w:t>
+            </w:r>
+            <w:r>
+              <w:t xml:space="preserve">the subset where it holds in a majority of 1,000 resamples.</w:t>
+            </w:r>
+          </w:p>
+          <w:tbl>
+            <w:tblPr>
+              <w:tblStyle w:val="Table"/>
+              <w:tblW w:type="auto" w:w="0"/>
+              <w:tblLook w:firstRow="1" w:lastRow="0" w:firstColumn="0" w:lastColumn="0" w:noHBand="0" w:noVBand="0" w:val="0020"/>
+            </w:tblPr>
+            <w:tblGrid>
+              <w:gridCol w:w="1980"/>
+              <w:gridCol w:w="1980"/>
+              <w:gridCol w:w="1980"/>
+              <w:gridCol w:w="1980"/>
+            </w:tblGrid>
+            <w:tr>
+              <w:trPr>
+                <w:tblHeader w:val="on"/>
+              </w:trPr>
+              <w:tc>
+                <w:tcPr/>
+                <w:p>
+                  <w:pPr>
+                    <w:pStyle w:val="Compact"/>
+                    <w:jc w:val="left"/>
+                    <w:jc w:val="center"/>
+                  </w:pPr>
+                  <w:r>
+                    <w:t xml:space="preserve">Belief</w:t>
+                  </w:r>
+                </w:p>
+              </w:tc>
+              <w:tc>
+                <w:tcPr/>
+                <w:p>
+                  <w:pPr>
+                    <w:pStyle w:val="Compact"/>
+                    <w:jc w:val="right"/>
+                    <w:jc w:val="center"/>
+                  </w:pPr>
+                  <w:r>
+                    <w:t xml:space="preserve">Mean rank</w:t>
+                  </w:r>
+                </w:p>
+              </w:tc>
+              <w:tc>
+                <w:tcPr/>
+                <w:p>
+                  <w:pPr>
+                    <w:pStyle w:val="Compact"/>
+                    <w:jc w:val="right"/>
+                    <w:jc w:val="center"/>
+                  </w:pPr>
+                  <w:r>
+                    <w:t xml:space="preserve">Closest in</w:t>
+                  </w:r>
+                </w:p>
+              </w:tc>
+              <w:tc>
+                <w:tcPr/>
+                <w:p>
+                  <w:pPr>
+                    <w:pStyle w:val="Compact"/>
+                    <w:jc w:val="right"/>
+                    <w:jc w:val="center"/>
+                  </w:pPr>
+                  <w:r>
+                    <w:t xml:space="preserve">Bootstrap-supported</w:t>
+                  </w:r>
+                </w:p>
+              </w:tc>
+            </w:tr>
+            <w:tr>
+              <w:tc>
+                <w:tcPr/>
+                <w:p>
+                  <w:pPr>
+                    <w:pStyle w:val="Compact"/>
+                    <w:jc w:val="left"/>
+                    <w:jc w:val="center"/>
+                  </w:pPr>
+                  <w:r>
+                    <w:t xml:space="preserve">Environmental commitment</w:t>
+                  </w:r>
+                </w:p>
+              </w:tc>
+              <w:tc>
+                <w:tcPr/>
+                <w:p>
+                  <w:pPr>
+                    <w:pStyle w:val="Compact"/>
+                    <w:jc w:val="right"/>
+                    <w:jc w:val="center"/>
+                  </w:pPr>
+                  <w:r>
+                    <w:t xml:space="preserve">1.25</w:t>
+                  </w:r>
+                </w:p>
+              </w:tc>
+              <w:tc>
+                <w:tcPr/>
+                <w:p>
+                  <w:pPr>
+                    <w:pStyle w:val="Compact"/>
+                    <w:jc w:val="right"/>
+                    <w:jc w:val="center"/>
+                  </w:pPr>
+                  <w:r>
+                    <w:t xml:space="preserve">24</w:t>
+                  </w:r>
+                </w:p>
+              </w:tc>
+              <w:tc>
+                <w:tcPr/>
+                <w:p>
+                  <w:pPr>
+                    <w:pStyle w:val="Compact"/>
+                    <w:jc w:val="right"/>
+                    <w:jc w:val="center"/>
+                  </w:pPr>
+                  <w:r>
+                    <w:t xml:space="preserve">24</w:t>
+                  </w:r>
+                </w:p>
+              </w:tc>
+            </w:tr>
+            <w:tr>
+              <w:tc>
+                <w:tcPr/>
+                <w:p>
+                  <w:pPr>
+                    <w:pStyle w:val="Compact"/>
+                    <w:jc w:val="left"/>
+                    <w:jc w:val="center"/>
+                  </w:pPr>
+                  <w:r>
+                    <w:t xml:space="preserve">Ecological worldview</w:t>
+                  </w:r>
+                </w:p>
+              </w:tc>
+              <w:tc>
+                <w:tcPr/>
+                <w:p>
+                  <w:pPr>
+                    <w:pStyle w:val="Compact"/>
+                    <w:jc w:val="right"/>
+                    <w:jc w:val="center"/>
+                  </w:pPr>
+                  <w:r>
+                    <w:t xml:space="preserve">2.50</w:t>
+                  </w:r>
+                </w:p>
+              </w:tc>
+              <w:tc>
+                <w:tcPr/>
+                <w:p>
+                  <w:pPr>
+                    <w:pStyle w:val="Compact"/>
+                    <w:jc w:val="right"/>
+                    <w:jc w:val="center"/>
+                  </w:pPr>
+                  <w:r>
+                    <w:t xml:space="preserve">1</w:t>
+                  </w:r>
+                </w:p>
+              </w:tc>
+              <w:tc>
+                <w:tcPr/>
+                <w:p>
+                  <w:pPr>
+                    <w:pStyle w:val="Compact"/>
+                    <w:jc w:val="right"/>
+                    <w:jc w:val="center"/>
+                  </w:pPr>
+                  <w:r>
+                    <w:t xml:space="preserve">0</w:t>
+                  </w:r>
+                </w:p>
+              </w:tc>
+            </w:tr>
+            <w:tr>
+              <w:tc>
+                <w:tcPr/>
+                <w:p>
+                  <w:pPr>
+                    <w:pStyle w:val="Compact"/>
+                    <w:jc w:val="left"/>
+                    <w:jc w:val="center"/>
+                  </w:pPr>
+                  <w:r>
+                    <w:t xml:space="preserve">Nature affinity</w:t>
+                  </w:r>
+                </w:p>
+              </w:tc>
+              <w:tc>
+                <w:tcPr/>
+                <w:p>
+                  <w:pPr>
+                    <w:pStyle w:val="Compact"/>
+                    <w:jc w:val="right"/>
+                    <w:jc w:val="center"/>
+                  </w:pPr>
+                  <w:r>
+                    <w:t xml:space="preserve">3.00</w:t>
+                  </w:r>
+                </w:p>
+              </w:tc>
+              <w:tc>
+                <w:tcPr/>
+                <w:p>
+                  <w:pPr>
+                    <w:pStyle w:val="Compact"/>
+                    <w:jc w:val="right"/>
+                    <w:jc w:val="center"/>
+                  </w:pPr>
+                  <w:r>
+                    <w:t xml:space="preserve">3</w:t>
+                  </w:r>
+                </w:p>
+              </w:tc>
+              <w:tc>
+                <w:tcPr/>
+                <w:p>
+                  <w:pPr>
+                    <w:pStyle w:val="Compact"/>
+                    <w:jc w:val="right"/>
+                    <w:jc w:val="center"/>
+                  </w:pPr>
+                  <w:r>
+                    <w:t xml:space="preserve">2</w:t>
+                  </w:r>
+                </w:p>
+              </w:tc>
+            </w:tr>
+            <w:tr>
+              <w:tc>
+                <w:tcPr/>
+                <w:p>
+                  <w:pPr>
+                    <w:pStyle w:val="Compact"/>
+                    <w:jc w:val="left"/>
+                    <w:jc w:val="center"/>
+                  </w:pPr>
+                  <w:r>
+                    <w:t xml:space="preserve">Perceived threat</w:t>
+                  </w:r>
+                </w:p>
+              </w:tc>
+              <w:tc>
+                <w:tcPr/>
+                <w:p>
+                  <w:pPr>
+                    <w:pStyle w:val="Compact"/>
+                    <w:jc w:val="right"/>
+                    <w:jc w:val="center"/>
+                  </w:pPr>
+                  <w:r>
+                    <w:t xml:space="preserve">3.82</w:t>
+                  </w:r>
+                </w:p>
+              </w:tc>
+              <w:tc>
+                <w:tcPr/>
+                <w:p>
+                  <w:pPr>
+                    <w:pStyle w:val="Compact"/>
+                    <w:jc w:val="right"/>
+                    <w:jc w:val="center"/>
+                  </w:pPr>
+                  <w:r>
+                    <w:t xml:space="preserve">0</w:t>
+                  </w:r>
+                </w:p>
+              </w:tc>
+              <w:tc>
+                <w:tcPr/>
+                <w:p>
+                  <w:pPr>
+                    <w:pStyle w:val="Compact"/>
+                    <w:jc w:val="right"/>
+                    <w:jc w:val="center"/>
+                  </w:pPr>
+                  <w:r>
+                    <w:t xml:space="preserve">0</w:t>
+                  </w:r>
+                </w:p>
+              </w:tc>
+            </w:tr>
+            <w:tr>
+              <w:tc>
+                <w:tcPr/>
+                <w:p>
+                  <w:pPr>
+                    <w:pStyle w:val="Compact"/>
+                    <w:jc w:val="left"/>
+                    <w:jc w:val="center"/>
+                  </w:pPr>
+                  <w:r>
+                    <w:t xml:space="preserve">Ideology (left-right)</w:t>
+                  </w:r>
+                </w:p>
+              </w:tc>
+              <w:tc>
+                <w:tcPr/>
+                <w:p>
+                  <w:pPr>
+                    <w:pStyle w:val="Compact"/>
+                    <w:jc w:val="right"/>
+                    <w:jc w:val="center"/>
+                  </w:pPr>
+                  <w:r>
+                    <w:t xml:space="preserve">4.06</w:t>
+                  </w:r>
+                </w:p>
+              </w:tc>
+              <w:tc>
+                <w:tcPr/>
+                <w:p>
+                  <w:pPr>
+                    <w:pStyle w:val="Compact"/>
+                    <w:jc w:val="right"/>
+                    <w:jc w:val="center"/>
+                  </w:pPr>
+                  <w:r>
+                    <w:t xml:space="preserve">1</w:t>
+                  </w:r>
+                </w:p>
+              </w:tc>
+              <w:tc>
+                <w:tcPr/>
+                <w:p>
+                  <w:pPr>
+                    <w:pStyle w:val="Compact"/>
+                    <w:jc w:val="right"/>
+                    <w:jc w:val="center"/>
+                  </w:pPr>
+                  <w:r>
+                    <w:t xml:space="preserve">1</w:t>
+                  </w:r>
+                </w:p>
+              </w:tc>
+            </w:tr>
+          </w:tbl>
+          <w:bookmarkEnd w:id="34"/>
+          <w:p/>
         </w:tc>
       </w:tr>
     </w:tbl>
     <w:p>
+      <w:pPr>
+        <w:pStyle w:val="BodyText"/>
+      </w:pPr>
+      <w:r>
+        <w:t xml:space="preserve">As noted, the belief that combines concern, willingness to pay, and a personal norm to act sits closest to behavior in both studies, while the more abstract worldview measures are further away. This is likely because beliefs tied to identity and personal commitment are more proximate to action than beliefs about how the natural world works.</w:t>
+      </w:r>
+    </w:p>
+    <w:p>
       <w:r>
         <w:br w:type="page"/>
       </w:r>
     </w:p>
-    <w:bookmarkEnd w:id="25"/>
-    <w:bookmarkEnd w:id="26"/>
-    <w:bookmarkStart w:id="27" w:name="appendix"/>
+    <w:bookmarkEnd w:id="35"/>
+    <w:bookmarkEnd w:id="36"/>
+    <w:bookmarkStart w:id="37" w:name="references"/>
     <w:p>
       <w:pPr>
         <w:pStyle w:val="Heading1"/>
       </w:pPr>
       <w:r>
-        <w:t xml:space="preserve">Appendix</w:t>
+        <w:t xml:space="preserve">References</w:t>
       </w:r>
     </w:p>
-    <w:p>
-      <w:r>
-        <w:br w:type="page"/>
-      </w:r>
-    </w:p>
-    <w:bookmarkEnd w:id="27"/>
-    <w:bookmarkStart w:id="28" w:name="references"/>
-    <w:p>
-      <w:pPr>
-        <w:pStyle w:val="Heading1"/>
-      </w:pPr>
-      <w:r>
-        <w:t xml:space="preserve">References</w:t>
-      </w:r>
-    </w:p>
-    <w:bookmarkEnd w:id="28"/>
+    <w:bookmarkEnd w:id="37"/>
     <w:sectPr>
       <w:footnotePr>
         <w:numRestart w:val="eachSect"/>

</xml_diff>